<commit_message>
Build the public website: home, request forms, partner registration, staff intake
Replaces the / -> /login redirect with a public site under app/(site)/.
Three client request forms write guest_enquiries beside the untouched /book
flow; three partner registration pages write the new supply_partners table;
/staff/intake shows both to staff roles. Migration 20261010 is not yet run.

Co-Authored-By: Claude Opus 5.5 <noreply@anthropic.com>
</commit_message>
<xml_diff>
--- a/docs/PRO_ENGINEERING_STACK_RECORD.docx
+++ b/docs/PRO_ENGINEERING_STACK_RECORD.docx
@@ -1015,7 +1015,7 @@
                 <w:sz w:val="20"/>
                 <w:szCs w:val="20"/>
               </w:rPr>
-              <w:t xml:space="preserve">Supabase database (PostgreSQL)</w:t>
+              <w:t xml:space="preserve">Supabase database (PostgreSQL 17.6)</w:t>
             </w:r>
           </w:p>
         </w:tc>
@@ -1045,7 +1045,7 @@
                 <w:sz w:val="20"/>
                 <w:szCs w:val="20"/>
               </w:rPr>
-              <w:t xml:space="preserve">All data: jobs, workers, estimates, milestones, payments</w:t>
+              <w:t xml:space="preserve">All data: jobs, workers, estimates, milestones, payments. The PostgreSQL 17 goal is already met.</w:t>
             </w:r>
           </w:p>
         </w:tc>
@@ -1077,7 +1077,7 @@
                 <w:sz w:val="20"/>
                 <w:szCs w:val="20"/>
               </w:rPr>
-              <w:t xml:space="preserve">3</w:t>
+              <w:t xml:space="preserve">2a</w:t>
             </w:r>
           </w:p>
         </w:tc>
@@ -1107,7 +1107,7 @@
                 <w:sz w:val="20"/>
                 <w:szCs w:val="20"/>
               </w:rPr>
-              <w:t xml:space="preserve">Supabase Auth</w:t>
+              <w:t xml:space="preserve">Supabase Storage</w:t>
             </w:r>
           </w:p>
         </w:tc>
@@ -1137,7 +1137,7 @@
                 <w:sz w:val="20"/>
                 <w:szCs w:val="20"/>
               </w:rPr>
-              <w:t xml:space="preserve">Logins for staff roles, clients and workers</w:t>
+              <w:t xml:space="preserve">Uploaded files: worker photos and documents, site photos, daily-log photos</w:t>
             </w:r>
           </w:p>
         </w:tc>
@@ -1169,7 +1169,7 @@
                 <w:sz w:val="20"/>
                 <w:szCs w:val="20"/>
               </w:rPr>
-              <w:t xml:space="preserve">4</w:t>
+              <w:t xml:space="preserve">3</w:t>
             </w:r>
           </w:p>
         </w:tc>
@@ -1199,7 +1199,7 @@
                 <w:sz w:val="20"/>
                 <w:szCs w:val="20"/>
               </w:rPr>
-              <w:t xml:space="preserve">Supabase JavaScript library</w:t>
+              <w:t xml:space="preserve">Supabase Auth</w:t>
             </w:r>
           </w:p>
         </w:tc>
@@ -1229,7 +1229,7 @@
                 <w:sz w:val="20"/>
                 <w:szCs w:val="20"/>
               </w:rPr>
-              <w:t xml:space="preserve">How the app reads and writes the database</w:t>
+              <w:t xml:space="preserve">Logins for staff roles, clients and workers</w:t>
             </w:r>
           </w:p>
         </w:tc>
@@ -1261,6 +1261,98 @@
                 <w:sz w:val="20"/>
                 <w:szCs w:val="20"/>
               </w:rPr>
+              <w:t xml:space="preserve">4</w:t>
+            </w:r>
+          </w:p>
+        </w:tc>
+        <w:tc>
+          <w:tcPr>
+            <w:tcW w:type="dxa" w:w="3000"/>
+            <w:tcBorders>
+              <w:top w:val="single" w:color="BFBFBF" w:sz="4"/>
+              <w:left w:val="single" w:color="BFBFBF" w:sz="4"/>
+              <w:bottom w:val="single" w:color="BFBFBF" w:sz="4"/>
+              <w:right w:val="single" w:color="BFBFBF" w:sz="4"/>
+            </w:tcBorders>
+            <w:tcMar>
+              <w:top w:type="dxa" w:w="70"/>
+              <w:left w:type="dxa" w:w="100"/>
+              <w:bottom w:type="dxa" w:w="70"/>
+              <w:right w:type="dxa" w:w="100"/>
+            </w:tcMar>
+          </w:tcPr>
+          <w:p>
+            <w:r>
+              <w:rPr>
+                <w:rFonts w:ascii="Arial" w:cs="Arial" w:eastAsia="Arial" w:hAnsi="Arial"/>
+                <w:b w:val="false"/>
+                <w:bCs w:val="false"/>
+                <w:color w:val="000000"/>
+                <w:sz w:val="20"/>
+                <w:szCs w:val="20"/>
+              </w:rPr>
+              <w:t xml:space="preserve">Supabase JavaScript library</w:t>
+            </w:r>
+          </w:p>
+        </w:tc>
+        <w:tc>
+          <w:tcPr>
+            <w:tcW w:type="dxa" w:w="5326"/>
+            <w:tcBorders>
+              <w:top w:val="single" w:color="BFBFBF" w:sz="4"/>
+              <w:left w:val="single" w:color="BFBFBF" w:sz="4"/>
+              <w:bottom w:val="single" w:color="BFBFBF" w:sz="4"/>
+              <w:right w:val="single" w:color="BFBFBF" w:sz="4"/>
+            </w:tcBorders>
+            <w:tcMar>
+              <w:top w:type="dxa" w:w="70"/>
+              <w:left w:type="dxa" w:w="100"/>
+              <w:bottom w:type="dxa" w:w="70"/>
+              <w:right w:type="dxa" w:w="100"/>
+            </w:tcMar>
+          </w:tcPr>
+          <w:p>
+            <w:r>
+              <w:rPr>
+                <w:rFonts w:ascii="Arial" w:cs="Arial" w:eastAsia="Arial" w:hAnsi="Arial"/>
+                <w:b w:val="false"/>
+                <w:bCs w:val="false"/>
+                <w:color w:val="000000"/>
+                <w:sz w:val="20"/>
+                <w:szCs w:val="20"/>
+              </w:rPr>
+              <w:t xml:space="preserve">How the app reads and writes the database</w:t>
+            </w:r>
+          </w:p>
+        </w:tc>
+      </w:tr>
+      <w:tr>
+        <w:tc>
+          <w:tcPr>
+            <w:tcW w:type="dxa" w:w="700"/>
+            <w:tcBorders>
+              <w:top w:val="single" w:color="BFBFBF" w:sz="4"/>
+              <w:left w:val="single" w:color="BFBFBF" w:sz="4"/>
+              <w:bottom w:val="single" w:color="BFBFBF" w:sz="4"/>
+              <w:right w:val="single" w:color="BFBFBF" w:sz="4"/>
+            </w:tcBorders>
+            <w:tcMar>
+              <w:top w:type="dxa" w:w="70"/>
+              <w:left w:type="dxa" w:w="100"/>
+              <w:bottom w:type="dxa" w:w="70"/>
+              <w:right w:type="dxa" w:w="100"/>
+            </w:tcMar>
+          </w:tcPr>
+          <w:p>
+            <w:r>
+              <w:rPr>
+                <w:rFonts w:ascii="Arial" w:cs="Arial" w:eastAsia="Arial" w:hAnsi="Arial"/>
+                <w:b w:val="false"/>
+                <w:bCs w:val="false"/>
+                <w:color w:val="000000"/>
+                <w:sz w:val="20"/>
+                <w:szCs w:val="20"/>
+              </w:rPr>
               <w:t xml:space="preserve">5</w:t>
             </w:r>
           </w:p>
@@ -1291,7 +1383,7 @@
                 <w:sz w:val="20"/>
                 <w:szCs w:val="20"/>
               </w:rPr>
-              <w:t xml:space="preserve">Vercel scheduled jobs (3)</w:t>
+              <w:t xml:space="preserve">Vercel scheduled jobs (2 jobs, 3 daily schedules)</w:t>
             </w:r>
           </w:p>
         </w:tc>
@@ -1914,7 +2006,7 @@
                 <w:sz w:val="20"/>
                 <w:szCs w:val="20"/>
               </w:rPr>
-              <w:t xml:space="preserve">With the first feature that uploads photos or documents</w:t>
+              <w:t xml:space="preserve">A separate move after AWS hosting is live. Files stay in Supabase Storage until then, as agreed.</w:t>
             </w:r>
           </w:p>
         </w:tc>
@@ -2068,7 +2160,7 @@
                 <w:sz w:val="20"/>
                 <w:szCs w:val="20"/>
               </w:rPr>
-              <w:t xml:space="preserve">PostgreSQL 17 on AWS, replacing Supabase</w:t>
+              <w:t xml:space="preserve">PostgreSQL 17 in your own AWS account, replacing Supabase</w:t>
             </w:r>
           </w:p>
         </w:tc>
@@ -2750,7 +2842,7 @@
           <w:sz w:val="21"/>
           <w:szCs w:val="21"/>
         </w:rPr>
-        <w:t xml:space="preserve">The three scheduled jobs that Vercel runs today are recreated on the server, because they do not exist outside Vercel.</w:t>
+        <w:t xml:space="preserve">The two scheduled jobs that Vercel runs today are recreated on the server, because they do not exist outside Vercel.</w:t>
       </w:r>
     </w:p>
     <w:p>

</xml_diff>